<commit_message>
add new progress for HW6
</commit_message>
<xml_diff>
--- a/HW6/result/Homework 6.docx
+++ b/HW6/result/Homework 6.docx
@@ -22,6 +22,9 @@
     </w:p>
     <w:p>
       <w:r>
+        <w:rPr>
+          <w:noProof/>
+        </w:rPr>
         <w:drawing>
           <wp:inline distT="0" distB="0" distL="0" distR="0" wp14:anchorId="4793F46C" wp14:editId="51CB5AAD">
             <wp:extent cx="5000662" cy="4838735"/>
@@ -67,8 +70,10 @@
     <w:p>
       <w:pPr>
         <w:rPr>
-          <w:b/>
-          <w:bCs/>
+          <w:rFonts w:hint="cs"/>
+          <w:b/>
+          <w:bCs/>
+          <w:cs/>
         </w:rPr>
       </w:pPr>
       <w:r>
@@ -81,7 +86,168 @@
     </w:p>
     <w:p>
       <w:r>
-        <w:t>-</w:t>
+        <w:drawing>
+          <wp:inline distT="0" distB="0" distL="0" distR="0" wp14:anchorId="4C83A27A" wp14:editId="6E7248C9">
+            <wp:extent cx="5676900" cy="1695450"/>
+            <wp:effectExtent l="19050" t="19050" r="19050" b="19050"/>
+            <wp:docPr id="1817472652" name="Picture 8"/>
+            <wp:cNvGraphicFramePr>
+              <a:graphicFrameLocks xmlns:a="http://schemas.openxmlformats.org/drawingml/2006/main" noChangeAspect="1"/>
+            </wp:cNvGraphicFramePr>
+            <a:graphic xmlns:a="http://schemas.openxmlformats.org/drawingml/2006/main">
+              <a:graphicData uri="http://schemas.openxmlformats.org/drawingml/2006/picture">
+                <pic:pic xmlns:pic="http://schemas.openxmlformats.org/drawingml/2006/picture">
+                  <pic:nvPicPr>
+                    <pic:cNvPr id="0" name="Picture 30"/>
+                    <pic:cNvPicPr>
+                      <a:picLocks noChangeAspect="1" noChangeArrowheads="1"/>
+                    </pic:cNvPicPr>
+                  </pic:nvPicPr>
+                  <pic:blipFill rotWithShape="1">
+                    <a:blip r:embed="rId5">
+                      <a:extLst>
+                        <a:ext uri="{28A0092B-C50C-407E-A947-70E740481C1C}">
+                          <a14:useLocalDpi xmlns:a14="http://schemas.microsoft.com/office/drawing/2010/main" val="0"/>
+                        </a:ext>
+                      </a:extLst>
+                    </a:blip>
+                    <a:srcRect t="4254" r="953" b="1098"/>
+                    <a:stretch/>
+                  </pic:blipFill>
+                  <pic:spPr bwMode="auto">
+                    <a:xfrm>
+                      <a:off x="0" y="0"/>
+                      <a:ext cx="5676900" cy="1695450"/>
+                    </a:xfrm>
+                    <a:prstGeom prst="rect">
+                      <a:avLst/>
+                    </a:prstGeom>
+                    <a:noFill/>
+                    <a:ln w="3175">
+                      <a:solidFill>
+                        <a:schemeClr val="tx1"/>
+                      </a:solidFill>
+                    </a:ln>
+                    <a:extLst>
+                      <a:ext uri="{53640926-AAD7-44D8-BBD7-CCE9431645EC}">
+                        <a14:shadowObscured xmlns:a14="http://schemas.microsoft.com/office/drawing/2010/main"/>
+                      </a:ext>
+                    </a:extLst>
+                  </pic:spPr>
+                </pic:pic>
+              </a:graphicData>
+            </a:graphic>
+          </wp:inline>
+        </w:drawing>
+      </w:r>
+    </w:p>
+    <w:p>
+      <w:pPr>
+        <w:rPr>
+          <w:b/>
+          <w:bCs/>
+        </w:rPr>
+      </w:pPr>
+      <w:r>
+        <w:rPr>
+          <w:b/>
+          <w:bCs/>
+        </w:rPr>
+        <w:t>1(b) Solve this model</w:t>
+      </w:r>
+    </w:p>
+    <w:p>
+      <w:r>
+        <w:rPr>
+          <w:rFonts w:hint="cs"/>
+          <w:u w:val="single"/>
+          <w:cs/>
+        </w:rPr>
+        <w:t>ตอบ</w:t>
+      </w:r>
+      <w:r>
+        <w:rPr>
+          <w:rFonts w:hint="cs"/>
+          <w:cs/>
+        </w:rPr>
+        <w:t xml:space="preserve"> </w:t>
+      </w:r>
+      <w:r>
+        <w:rPr>
+          <w:rFonts w:hint="cs"/>
+          <w:cs/>
+        </w:rPr>
+        <w:t xml:space="preserve">จากการแก้สมการจะได้ว่า เมื่อกำหนด </w:t>
+      </w:r>
+      <w:r>
+        <w:t xml:space="preserve">capacity </w:t>
+      </w:r>
+      <w:r>
+        <w:rPr>
+          <w:rFonts w:hint="cs"/>
+          <w:cs/>
+        </w:rPr>
+        <w:t>อยู่ที่</w:t>
+      </w:r>
+      <w:r>
+        <w:t xml:space="preserve"> 0.65 </w:t>
+      </w:r>
+      <w:r>
+        <w:rPr>
+          <w:rFonts w:hint="cs"/>
+          <w:cs/>
+        </w:rPr>
+        <w:t xml:space="preserve">เราควรตั้งราคาไฟฟ้าช่วง </w:t>
+      </w:r>
+      <w:r>
+        <w:t xml:space="preserve">peak-load </w:t>
+      </w:r>
+      <w:r>
+        <w:rPr>
+          <w:rFonts w:hint="cs"/>
+          <w:cs/>
+        </w:rPr>
+        <w:t xml:space="preserve">อยู่ที่ </w:t>
+      </w:r>
+      <w:r>
+        <w:t>$141.78</w:t>
+      </w:r>
+      <w:r>
+        <w:rPr>
+          <w:rFonts w:hint="cs"/>
+          <w:cs/>
+        </w:rPr>
+        <w:t xml:space="preserve"> และ ช่วง </w:t>
+      </w:r>
+      <w:r>
+        <w:t xml:space="preserve">off-peak </w:t>
+      </w:r>
+      <w:r>
+        <w:rPr>
+          <w:rFonts w:hint="cs"/>
+          <w:cs/>
+        </w:rPr>
+        <w:t>อยู่ที่</w:t>
+      </w:r>
+      <w:r>
+        <w:t xml:space="preserve"> $80.06 </w:t>
+      </w:r>
+      <w:r>
+        <w:rPr>
+          <w:rFonts w:hint="cs"/>
+          <w:cs/>
+        </w:rPr>
+        <w:t xml:space="preserve"> จึงจะได้กำไรสูงสุดอยู่ที่ </w:t>
+      </w:r>
+      <w:r>
+        <w:t>$95.45</w:t>
+      </w:r>
+      <w:r>
+        <w:rPr>
+          <w:rFonts w:hint="cs"/>
+          <w:cs/>
+        </w:rPr>
+        <w:t xml:space="preserve">  </w:t>
       </w:r>
     </w:p>
     <w:p/>
@@ -97,117 +263,7 @@
           <w:b/>
           <w:bCs/>
         </w:rPr>
-        <w:t>1(b) Solve this model</w:t>
-      </w:r>
-    </w:p>
-    <w:p>
-      <w:r>
-        <w:rPr>
-          <w:rFonts w:hint="cs"/>
-          <w:u w:val="single"/>
-          <w:cs/>
-        </w:rPr>
-        <w:t>ตอบ</w:t>
-      </w:r>
-      <w:r>
-        <w:rPr>
-          <w:rFonts w:hint="cs"/>
-          <w:u w:val="single"/>
-          <w:cs/>
-        </w:rPr>
-        <w:t xml:space="preserve"> </w:t>
-      </w:r>
-      <w:r>
-        <w:rPr>
-          <w:rFonts w:hint="cs"/>
-          <w:cs/>
-        </w:rPr>
-        <w:t xml:space="preserve">จากการแก้สมการจะได้ว่า เมื่อกำหนด </w:t>
-      </w:r>
-      <w:r>
-        <w:t xml:space="preserve">capacity </w:t>
-      </w:r>
-      <w:r>
-        <w:rPr>
-          <w:rFonts w:hint="cs"/>
-          <w:cs/>
-        </w:rPr>
-        <w:t>อยู่ที่</w:t>
-      </w:r>
-      <w:r>
-        <w:t xml:space="preserve"> 0.65 </w:t>
-      </w:r>
-      <w:r>
-        <w:rPr>
-          <w:rFonts w:hint="cs"/>
-          <w:cs/>
-        </w:rPr>
-        <w:t xml:space="preserve">เราควรตั้งราคาไฟฟ้าช่วง </w:t>
-      </w:r>
-      <w:r>
-        <w:t xml:space="preserve">peak-load </w:t>
-      </w:r>
-      <w:r>
-        <w:rPr>
-          <w:rFonts w:hint="cs"/>
-          <w:cs/>
-        </w:rPr>
-        <w:t xml:space="preserve">อยู่ที่ </w:t>
-      </w:r>
-      <w:r>
-        <w:t>$141.78</w:t>
-      </w:r>
-      <w:r>
-        <w:rPr>
-          <w:rFonts w:hint="cs"/>
-          <w:cs/>
-        </w:rPr>
-        <w:t xml:space="preserve"> และ ช่วง </w:t>
-      </w:r>
-      <w:r>
-        <w:t xml:space="preserve">off-peak </w:t>
-      </w:r>
-      <w:r>
-        <w:rPr>
-          <w:rFonts w:hint="cs"/>
-          <w:cs/>
-        </w:rPr>
-        <w:t>อยู่ที่</w:t>
-      </w:r>
-      <w:r>
-        <w:t xml:space="preserve"> $80.06 </w:t>
-      </w:r>
-      <w:r>
-        <w:rPr>
-          <w:rFonts w:hint="cs"/>
-          <w:cs/>
-        </w:rPr>
-        <w:t xml:space="preserve"> จึงจะได้กำไรสูงสุดอยู่ที่ </w:t>
-      </w:r>
-      <w:r>
-        <w:t>$95.45</w:t>
-      </w:r>
-      <w:r>
-        <w:rPr>
-          <w:rFonts w:hint="cs"/>
-          <w:cs/>
-        </w:rPr>
-        <w:t xml:space="preserve">  </w:t>
-      </w:r>
-    </w:p>
-    <w:p/>
-    <w:p>
-      <w:pPr>
-        <w:rPr>
-          <w:b/>
-          <w:bCs/>
-        </w:rPr>
-      </w:pPr>
-      <w:r>
-        <w:rPr>
-          <w:b/>
-          <w:bCs/>
-        </w:rPr>
+        <w:lastRenderedPageBreak/>
         <w:t>2(a) Write the problem using the matrix notation</w:t>
       </w:r>
     </w:p>
@@ -220,12 +276,59 @@
       </w:pPr>
       <w:r>
         <w:rPr>
-          <w:rFonts w:hint="cs"/>
-          <w:b/>
-          <w:bCs/>
-          <w:cs/>
-        </w:rPr>
-        <w:t>-</w:t>
+          <w:b/>
+          <w:bCs/>
+        </w:rPr>
+        <w:drawing>
+          <wp:inline distT="0" distB="0" distL="0" distR="0" wp14:anchorId="029EAC8A" wp14:editId="2FA739EF">
+            <wp:extent cx="5731510" cy="7395210"/>
+            <wp:effectExtent l="19050" t="19050" r="21590" b="15240"/>
+            <wp:docPr id="1184062699" name="Picture 2"/>
+            <wp:cNvGraphicFramePr>
+              <a:graphicFrameLocks xmlns:a="http://schemas.openxmlformats.org/drawingml/2006/main" noChangeAspect="1"/>
+            </wp:cNvGraphicFramePr>
+            <a:graphic xmlns:a="http://schemas.openxmlformats.org/drawingml/2006/main">
+              <a:graphicData uri="http://schemas.openxmlformats.org/drawingml/2006/picture">
+                <pic:pic xmlns:pic="http://schemas.openxmlformats.org/drawingml/2006/picture">
+                  <pic:nvPicPr>
+                    <pic:cNvPr id="0" name="Picture 6"/>
+                    <pic:cNvPicPr>
+                      <a:picLocks noChangeAspect="1" noChangeArrowheads="1"/>
+                    </pic:cNvPicPr>
+                  </pic:nvPicPr>
+                  <pic:blipFill>
+                    <a:blip r:embed="rId6">
+                      <a:extLst>
+                        <a:ext uri="{28A0092B-C50C-407E-A947-70E740481C1C}">
+                          <a14:useLocalDpi xmlns:a14="http://schemas.microsoft.com/office/drawing/2010/main" val="0"/>
+                        </a:ext>
+                      </a:extLst>
+                    </a:blip>
+                    <a:srcRect/>
+                    <a:stretch>
+                      <a:fillRect/>
+                    </a:stretch>
+                  </pic:blipFill>
+                  <pic:spPr bwMode="auto">
+                    <a:xfrm>
+                      <a:off x="0" y="0"/>
+                      <a:ext cx="5731510" cy="7395210"/>
+                    </a:xfrm>
+                    <a:prstGeom prst="rect">
+                      <a:avLst/>
+                    </a:prstGeom>
+                    <a:noFill/>
+                    <a:ln w="3175">
+                      <a:solidFill>
+                        <a:schemeClr val="tx1"/>
+                      </a:solidFill>
+                    </a:ln>
+                  </pic:spPr>
+                </pic:pic>
+              </a:graphicData>
+            </a:graphic>
+          </wp:inline>
+        </w:drawing>
       </w:r>
     </w:p>
     <w:p>
@@ -259,6 +362,14 @@
           <w:bCs/>
         </w:rPr>
       </w:pPr>
+      <w:r>
+        <w:rPr>
+          <w:b/>
+          <w:bCs/>
+        </w:rPr>
+        <w:lastRenderedPageBreak/>
+        <w:t xml:space="preserve">2(b) Is this problem convex quadratic program (CQP)? </w:t>
+      </w:r>
     </w:p>
     <w:p>
       <w:pPr>
@@ -272,22 +383,236 @@
           <w:b/>
           <w:bCs/>
         </w:rPr>
-        <w:t xml:space="preserve">2(b) Is this problem convex quadratic program (CQP)? </w:t>
+        <w:drawing>
+          <wp:inline distT="0" distB="0" distL="0" distR="0" wp14:anchorId="7A486F92" wp14:editId="6D4F816D">
+            <wp:extent cx="5286375" cy="2514600"/>
+            <wp:effectExtent l="19050" t="19050" r="28575" b="19050"/>
+            <wp:docPr id="2049713792" name="Picture 10"/>
+            <wp:cNvGraphicFramePr>
+              <a:graphicFrameLocks xmlns:a="http://schemas.openxmlformats.org/drawingml/2006/main" noChangeAspect="1"/>
+            </wp:cNvGraphicFramePr>
+            <a:graphic xmlns:a="http://schemas.openxmlformats.org/drawingml/2006/main">
+              <a:graphicData uri="http://schemas.openxmlformats.org/drawingml/2006/picture">
+                <pic:pic xmlns:pic="http://schemas.openxmlformats.org/drawingml/2006/picture">
+                  <pic:nvPicPr>
+                    <pic:cNvPr id="0" name="Picture 37"/>
+                    <pic:cNvPicPr>
+                      <a:picLocks noChangeAspect="1" noChangeArrowheads="1"/>
+                    </pic:cNvPicPr>
+                  </pic:nvPicPr>
+                  <pic:blipFill rotWithShape="1">
+                    <a:blip r:embed="rId7" cstate="print">
+                      <a:extLst>
+                        <a:ext uri="{28A0092B-C50C-407E-A947-70E740481C1C}">
+                          <a14:useLocalDpi xmlns:a14="http://schemas.microsoft.com/office/drawing/2010/main" val="0"/>
+                        </a:ext>
+                      </a:extLst>
+                    </a:blip>
+                    <a:srcRect r="7766" b="7778"/>
+                    <a:stretch/>
+                  </pic:blipFill>
+                  <pic:spPr bwMode="auto">
+                    <a:xfrm>
+                      <a:off x="0" y="0"/>
+                      <a:ext cx="5286375" cy="2514600"/>
+                    </a:xfrm>
+                    <a:prstGeom prst="rect">
+                      <a:avLst/>
+                    </a:prstGeom>
+                    <a:noFill/>
+                    <a:ln w="3175" cap="flat" cmpd="sng" algn="ctr">
+                      <a:solidFill>
+                        <a:sysClr val="windowText" lastClr="000000"/>
+                      </a:solidFill>
+                      <a:prstDash val="solid"/>
+                      <a:round/>
+                      <a:headEnd type="none" w="med" len="med"/>
+                      <a:tailEnd type="none" w="med" len="med"/>
+                      <a:extLst>
+                        <a:ext uri="{C807C97D-BFC1-408E-A445-0C87EB9F89A2}">
+                          <ask:lineSketchStyleProps xmlns:ask="http://schemas.microsoft.com/office/drawing/2018/sketchyshapes" sd="0">
+                            <a:custGeom>
+                              <a:avLst/>
+                              <a:gdLst/>
+                              <a:ahLst/>
+                              <a:cxnLst/>
+                              <a:rect l="0" t="0" r="0" b="0"/>
+                              <a:pathLst/>
+                            </a:custGeom>
+                            <ask:type/>
+                          </ask:lineSketchStyleProps>
+                        </a:ext>
+                      </a:extLst>
+                    </a:ln>
+                    <a:extLst>
+                      <a:ext uri="{53640926-AAD7-44D8-BBD7-CCE9431645EC}">
+                        <a14:shadowObscured xmlns:a14="http://schemas.microsoft.com/office/drawing/2010/main"/>
+                      </a:ext>
+                    </a:extLst>
+                  </pic:spPr>
+                </pic:pic>
+              </a:graphicData>
+            </a:graphic>
+          </wp:inline>
+        </w:drawing>
       </w:r>
     </w:p>
     <w:p>
       <w:pPr>
         <w:rPr>
-          <w:b/>
-          <w:bCs/>
+          <w:rFonts w:hint="cs"/>
+          <w:b/>
+          <w:bCs/>
+          <w:cs/>
         </w:rPr>
       </w:pPr>
       <w:r>
         <w:rPr>
-          <w:b/>
-          <w:bCs/>
+          <w:rFonts w:hint="cs"/>
+          <w:u w:val="single"/>
+          <w:cs/>
+        </w:rPr>
+        <w:t>ตอบ</w:t>
+      </w:r>
+      <w:r>
+        <w:t xml:space="preserve"> </w:t>
+      </w:r>
+      <w:r>
+        <w:rPr>
+          <w:rFonts w:hint="cs"/>
+          <w:cs/>
+        </w:rPr>
+        <w:t xml:space="preserve">ปัญหานี้เป็น </w:t>
+      </w:r>
+      <w:r>
+        <w:t xml:space="preserve">CQP </w:t>
+      </w:r>
+      <w:r>
+        <w:rPr>
+          <w:rFonts w:hint="cs"/>
+          <w:cs/>
+        </w:rPr>
+        <w:t xml:space="preserve">เพราะทุก </w:t>
+      </w:r>
+      <w:r>
+        <w:t xml:space="preserve">constraint </w:t>
+      </w:r>
+      <w:r>
+        <w:rPr>
+          <w:rFonts w:hint="cs"/>
+          <w:cs/>
+        </w:rPr>
+        <w:t xml:space="preserve">เป็น </w:t>
+      </w:r>
+      <w:r>
+        <w:t xml:space="preserve">linear </w:t>
+      </w:r>
+      <w:r>
+        <w:rPr>
+          <w:rFonts w:hint="cs"/>
+          <w:cs/>
+        </w:rPr>
+        <w:t xml:space="preserve">และ </w:t>
+      </w:r>
+      <w:r>
+        <w:t>Hessian matrix</w:t>
+      </w:r>
+      <w:r>
+        <w:rPr>
+          <w:rFonts w:hint="cs"/>
+          <w:cs/>
+        </w:rPr>
+        <w:t xml:space="preserve"> เป็น </w:t>
+      </w:r>
+      <w:r>
+        <w:t>n</w:t>
+      </w:r>
+      <w:r>
+        <w:t xml:space="preserve">egative </w:t>
+      </w:r>
+      <w:r>
+        <w:t>d</w:t>
+      </w:r>
+      <w:r>
+        <w:t>efinite</w:t>
+      </w:r>
+      <w:r>
+        <w:t xml:space="preserve"> (</w:t>
+      </w:r>
+      <w:r>
+        <w:rPr>
+          <w:rFonts w:hint="cs"/>
+          <w:cs/>
+        </w:rPr>
+        <w:t xml:space="preserve">เครื่องหมาย </w:t>
+      </w:r>
+      <w:r>
+        <w:t xml:space="preserve">+ </w:t>
+      </w:r>
+      <w:r>
+        <w:rPr>
+          <w:rFonts w:hint="cs"/>
+          <w:cs/>
+        </w:rPr>
+        <w:t xml:space="preserve">สลับ </w:t>
+      </w:r>
+      <w:r>
+        <w:rPr>
+          <w:rFonts w:hint="cs"/>
+          <w:cs/>
         </w:rPr>
         <w:t>-</w:t>
+      </w:r>
+      <w:r>
+        <w:rPr>
+          <w:rFonts w:hint="cs"/>
+          <w:cs/>
+        </w:rPr>
+        <w:t xml:space="preserve"> </w:t>
+      </w:r>
+      <w:r>
+        <w:t>)</w:t>
+      </w:r>
+      <w:r>
+        <w:rPr>
+          <w:rFonts w:hint="cs"/>
+          <w:cs/>
+        </w:rPr>
+        <w:t xml:space="preserve"> เมื่อ </w:t>
+      </w:r>
+      <w:r>
+        <w:t>objective function</w:t>
+      </w:r>
+      <w:r>
+        <w:rPr>
+          <w:rFonts w:hint="cs"/>
+          <w:cs/>
+        </w:rPr>
+        <w:t xml:space="preserve"> คือ</w:t>
+      </w:r>
+      <w:r>
+        <w:rPr>
+          <w:rFonts w:hint="cs"/>
+          <w:cs/>
+        </w:rPr>
+        <w:t>การทำ</w:t>
+      </w:r>
+      <w:r>
+        <w:rPr>
+          <w:rFonts w:hint="cs"/>
+          <w:cs/>
+        </w:rPr>
+        <w:t xml:space="preserve"> </w:t>
+      </w:r>
+      <w:r>
+        <w:t>maximization</w:t>
+      </w:r>
+      <w:r>
+        <w:rPr>
+          <w:rFonts w:hint="cs"/>
+          <w:cs/>
+        </w:rPr>
+        <w:t xml:space="preserve"> </w:t>
       </w:r>
     </w:p>
     <w:p>
@@ -305,6 +630,13 @@
           <w:bCs/>
         </w:rPr>
       </w:pPr>
+      <w:r>
+        <w:rPr>
+          <w:b/>
+          <w:bCs/>
+        </w:rPr>
+        <w:t>2(c)[Optional] Solve this problem by hand.</w:t>
+      </w:r>
     </w:p>
     <w:p>
       <w:pPr>
@@ -315,26 +647,10 @@
       </w:pPr>
       <w:r>
         <w:rPr>
-          <w:b/>
-          <w:bCs/>
-        </w:rPr>
-        <w:t>2(c)[Optional] Solve this problem by hand.</w:t>
-      </w:r>
-    </w:p>
-    <w:p>
-      <w:pPr>
-        <w:rPr>
-          <w:rFonts w:hint="cs"/>
-          <w:b/>
-          <w:bCs/>
-          <w:cs/>
-        </w:rPr>
-      </w:pPr>
-      <w:r>
-        <w:rPr>
           <w:rFonts w:cs="Cordia New"/>
           <w:b/>
           <w:bCs/>
+          <w:noProof/>
           <w:cs/>
         </w:rPr>
         <w:drawing>
@@ -353,7 +669,7 @@
                     <pic:cNvPicPr/>
                   </pic:nvPicPr>
                   <pic:blipFill>
-                    <a:blip r:embed="rId5"/>
+                    <a:blip r:embed="rId8"/>
                     <a:stretch>
                       <a:fillRect/>
                     </a:stretch>
@@ -362,6 +678,78 @@
                     <a:xfrm>
                       <a:off x="0" y="0"/>
                       <a:ext cx="5486440" cy="4638709"/>
+                    </a:xfrm>
+                    <a:prstGeom prst="rect">
+                      <a:avLst/>
+                    </a:prstGeom>
+                    <a:ln w="3175">
+                      <a:solidFill>
+                        <a:schemeClr val="tx1"/>
+                      </a:solidFill>
+                    </a:ln>
+                  </pic:spPr>
+                </pic:pic>
+              </a:graphicData>
+            </a:graphic>
+          </wp:inline>
+        </w:drawing>
+      </w:r>
+    </w:p>
+    <w:p>
+      <w:pPr>
+        <w:pStyle w:val="Heading2"/>
+        <w:spacing w:line="360" w:lineRule="auto"/>
+        <w:jc w:val="thaiDistribute"/>
+        <w:rPr>
+          <w:u w:val="single"/>
+        </w:rPr>
+      </w:pPr>
+      <w:r>
+        <w:rPr>
+          <w:u w:val="single"/>
+        </w:rPr>
+        <w:lastRenderedPageBreak/>
+        <w:t>A</w:t>
+      </w:r>
+      <w:r>
+        <w:rPr>
+          <w:u w:val="single"/>
+        </w:rPr>
+        <w:t>ppendix</w:t>
+      </w:r>
+    </w:p>
+    <w:p>
+      <w:pPr>
+        <w:rPr>
+          <w:cs/>
+        </w:rPr>
+      </w:pPr>
+      <w:r>
+        <w:drawing>
+          <wp:inline distT="0" distB="0" distL="0" distR="0" wp14:anchorId="3DFE0944" wp14:editId="254BC9F2">
+            <wp:extent cx="5266667" cy="5504762"/>
+            <wp:effectExtent l="19050" t="19050" r="10795" b="20320"/>
+            <wp:docPr id="136803663" name="Picture 1"/>
+            <wp:cNvGraphicFramePr>
+              <a:graphicFrameLocks xmlns:a="http://schemas.openxmlformats.org/drawingml/2006/main" noChangeAspect="1"/>
+            </wp:cNvGraphicFramePr>
+            <a:graphic xmlns:a="http://schemas.openxmlformats.org/drawingml/2006/main">
+              <a:graphicData uri="http://schemas.openxmlformats.org/drawingml/2006/picture">
+                <pic:pic xmlns:pic="http://schemas.openxmlformats.org/drawingml/2006/picture">
+                  <pic:nvPicPr>
+                    <pic:cNvPr id="136803663" name=""/>
+                    <pic:cNvPicPr/>
+                  </pic:nvPicPr>
+                  <pic:blipFill>
+                    <a:blip r:embed="rId9"/>
+                    <a:stretch>
+                      <a:fillRect/>
+                    </a:stretch>
+                  </pic:blipFill>
+                  <pic:spPr>
+                    <a:xfrm>
+                      <a:off x="0" y="0"/>
+                      <a:ext cx="5266667" cy="5504762"/>
                     </a:xfrm>
                     <a:prstGeom prst="rect">
                       <a:avLst/>

</xml_diff>